<commit_message>
Ship U3 printable paper with full-script answers, refresh U4 answers, and publish U3/U4 paper listening audio.
Co-authored-by: Cursor <cursoragent@cursor.com>
</commit_message>
<xml_diff>
--- a/exams/U4_Unit4_Practice_Answers.docx
+++ b/exams/U4_Unit4_Practice_Answers.docx
@@ -27,7 +27,7 @@
           <w:b w:val="0"/>
           <w:sz w:val="20"/>
         </w:rPr>
-        <w:t>（听力答案据《四上听力材料》脚本核对；图题答案对照原卷附图）</w:t>
+        <w:t>含完整英语听力原文 + 全部题目答案（听力据《四上听力材料》第四单元）</w:t>
       </w:r>
     </w:p>
     <w:p>
@@ -40,7 +40,7 @@
           <w:b/>
           <w:sz w:val="24"/>
         </w:rPr>
-        <w:t>听力部分</w:t>
+        <w:t>听力部分 · 原文与答案</w:t>
       </w:r>
     </w:p>
     <w:p>
@@ -51,27 +51,27 @@
         <w:rPr>
           <w:rFonts w:ascii="宋体" w:hAnsi="宋体" w:eastAsia="宋体"/>
           <w:b/>
-          <w:sz w:val="22"/>
+          <w:sz w:val="24"/>
         </w:rPr>
-        <w:t>一、听句子判断 T/F（材料脚本）：</w:t>
+        <w:t>一、听句子判断 T/F</w:t>
       </w:r>
     </w:p>
     <w:p>
       <w:pPr>
-        <w:spacing w:before="0" w:after="80" w:line="240" w:lineRule="auto"/>
+        <w:spacing w:before="0" w:after="40" w:line="240" w:lineRule="auto"/>
       </w:pPr>
       <w:r>
         <w:rPr>
           <w:rFonts w:ascii="宋体" w:hAnsi="宋体" w:eastAsia="宋体"/>
-          <w:b w:val="0"/>
-          <w:sz w:val="18"/>
+          <w:b/>
+          <w:sz w:val="20"/>
         </w:rPr>
-        <w:t>听力原文：1. Sometimes I feel excited.  2. My cat is white with a long tail.  3. The girl is ill today.  4. I often read books with my friends.  5. We should stand in line.  6. Could I have an apple, please?  7. May I use your eraser?  8. You should have a good rest.</w:t>
+        <w:t>【Listening script】</w:t>
       </w:r>
     </w:p>
     <w:p>
       <w:pPr>
-        <w:spacing w:before="0" w:after="120" w:line="240" w:lineRule="auto"/>
+        <w:spacing w:before="0" w:after="40" w:line="240" w:lineRule="auto"/>
       </w:pPr>
       <w:r>
         <w:rPr>
@@ -79,12 +79,103 @@
           <w:b w:val="0"/>
           <w:sz w:val="20"/>
         </w:rPr>
-        <w:t>答案：以课堂录音 + 卷面图片是否相符为准（打印卷附图同原卷）。常见卷面参考：请家长按图核验。</w:t>
+        <w:t>1. Sometimes I feel excited.</w:t>
       </w:r>
     </w:p>
     <w:p>
       <w:pPr>
-        <w:spacing w:before="0" w:after="80" w:line="240" w:lineRule="auto"/>
+        <w:spacing w:before="0" w:after="40" w:line="240" w:lineRule="auto"/>
+      </w:pPr>
+      <w:r>
+        <w:rPr>
+          <w:rFonts w:ascii="宋体" w:hAnsi="宋体" w:eastAsia="宋体"/>
+          <w:b w:val="0"/>
+          <w:sz w:val="20"/>
+        </w:rPr>
+        <w:t>2. My cat is white with a long tail.</w:t>
+      </w:r>
+    </w:p>
+    <w:p>
+      <w:pPr>
+        <w:spacing w:before="0" w:after="40" w:line="240" w:lineRule="auto"/>
+      </w:pPr>
+      <w:r>
+        <w:rPr>
+          <w:rFonts w:ascii="宋体" w:hAnsi="宋体" w:eastAsia="宋体"/>
+          <w:b w:val="0"/>
+          <w:sz w:val="20"/>
+        </w:rPr>
+        <w:t>3. The girl is ill today.</w:t>
+      </w:r>
+    </w:p>
+    <w:p>
+      <w:pPr>
+        <w:spacing w:before="0" w:after="40" w:line="240" w:lineRule="auto"/>
+      </w:pPr>
+      <w:r>
+        <w:rPr>
+          <w:rFonts w:ascii="宋体" w:hAnsi="宋体" w:eastAsia="宋体"/>
+          <w:b w:val="0"/>
+          <w:sz w:val="20"/>
+        </w:rPr>
+        <w:t>4. I often read books with my friends.</w:t>
+      </w:r>
+    </w:p>
+    <w:p>
+      <w:pPr>
+        <w:spacing w:before="0" w:after="40" w:line="240" w:lineRule="auto"/>
+      </w:pPr>
+      <w:r>
+        <w:rPr>
+          <w:rFonts w:ascii="宋体" w:hAnsi="宋体" w:eastAsia="宋体"/>
+          <w:b w:val="0"/>
+          <w:sz w:val="20"/>
+        </w:rPr>
+        <w:t>5. We should stand in line.</w:t>
+      </w:r>
+    </w:p>
+    <w:p>
+      <w:pPr>
+        <w:spacing w:before="0" w:after="40" w:line="240" w:lineRule="auto"/>
+      </w:pPr>
+      <w:r>
+        <w:rPr>
+          <w:rFonts w:ascii="宋体" w:hAnsi="宋体" w:eastAsia="宋体"/>
+          <w:b w:val="0"/>
+          <w:sz w:val="20"/>
+        </w:rPr>
+        <w:t>6. Could I have an apple, please?</w:t>
+      </w:r>
+    </w:p>
+    <w:p>
+      <w:pPr>
+        <w:spacing w:before="0" w:after="40" w:line="240" w:lineRule="auto"/>
+      </w:pPr>
+      <w:r>
+        <w:rPr>
+          <w:rFonts w:ascii="宋体" w:hAnsi="宋体" w:eastAsia="宋体"/>
+          <w:b w:val="0"/>
+          <w:sz w:val="20"/>
+        </w:rPr>
+        <w:t>7. May I use your eraser?</w:t>
+      </w:r>
+    </w:p>
+    <w:p>
+      <w:pPr>
+        <w:spacing w:before="0" w:after="40" w:line="240" w:lineRule="auto"/>
+      </w:pPr>
+      <w:r>
+        <w:rPr>
+          <w:rFonts w:ascii="宋体" w:hAnsi="宋体" w:eastAsia="宋体"/>
+          <w:b w:val="0"/>
+          <w:sz w:val="20"/>
+        </w:rPr>
+        <w:t>8. You should have a good rest.</w:t>
+      </w:r>
+    </w:p>
+    <w:p>
+      <w:pPr>
+        <w:spacing w:before="0" w:after="40" w:line="240" w:lineRule="auto"/>
       </w:pPr>
       <w:r>
         <w:rPr>
@@ -92,85 +183,7 @@
           <w:b/>
           <w:sz w:val="22"/>
         </w:rPr>
-        <w:t>二、听对话排序 A—E：</w:t>
-      </w:r>
-    </w:p>
-    <w:p>
-      <w:pPr>
-        <w:spacing w:before="0" w:after="120" w:line="240" w:lineRule="auto"/>
-      </w:pPr>
-      <w:r>
-        <w:rPr>
-          <w:rFonts w:ascii="宋体" w:hAnsi="宋体" w:eastAsia="宋体"/>
-          <w:b w:val="0"/>
-          <w:sz w:val="20"/>
-        </w:rPr>
-        <w:t>材料顺序：A 找英语书 → B 在读故事 → C 大声读 → D 电话找 Mike（在睡觉）→ E 借铅笔。卷面排序：把听到的第 1–5 段依次标到对应图上（答案依图序填写，对照附图）。</w:t>
-      </w:r>
-    </w:p>
-    <w:p>
-      <w:pPr>
-        <w:spacing w:before="0" w:after="80" w:line="240" w:lineRule="auto"/>
-      </w:pPr>
-      <w:r>
-        <w:rPr>
-          <w:rFonts w:ascii="宋体" w:hAnsi="宋体" w:eastAsia="宋体"/>
-          <w:b w:val="0"/>
-          <w:sz w:val="22"/>
-        </w:rPr>
-        <w:t>三、听选答语：1A  2B  3B  4A  5A</w:t>
-      </w:r>
-    </w:p>
-    <w:p>
-      <w:pPr>
-        <w:spacing w:before="0" w:after="120" w:line="240" w:lineRule="auto"/>
-      </w:pPr>
-      <w:r>
-        <w:rPr>
-          <w:rFonts w:ascii="宋体" w:hAnsi="宋体" w:eastAsia="宋体"/>
-          <w:b w:val="0"/>
-          <w:sz w:val="18"/>
-        </w:rPr>
-        <w:t>依据：1 open the window→Sure.  2 How do you feel→I am happy.  3 What's the matter / angry→My toy car is broken.  4 What does he look like→tall with short hair.  5 Can I fly a kite→Of course. Let's do it together.</w:t>
-      </w:r>
-    </w:p>
-    <w:p>
-      <w:pPr>
-        <w:spacing w:before="0" w:after="80" w:line="240" w:lineRule="auto"/>
-      </w:pPr>
-      <w:r>
-        <w:rPr>
-          <w:rFonts w:ascii="宋体" w:hAnsi="宋体" w:eastAsia="宋体"/>
-          <w:b w:val="0"/>
-          <w:sz w:val="22"/>
-        </w:rPr>
-        <w:t>四、听对话判断：1F  2F  3F  4T  5T</w:t>
-      </w:r>
-    </w:p>
-    <w:p>
-      <w:pPr>
-        <w:spacing w:before="0" w:after="120" w:line="240" w:lineRule="auto"/>
-      </w:pPr>
-      <w:r>
-        <w:rPr>
-          <w:rFonts w:ascii="宋体" w:hAnsi="宋体" w:eastAsia="宋体"/>
-          <w:b w:val="0"/>
-          <w:sz w:val="18"/>
-        </w:rPr>
-        <w:t>依据：Linda: Not very happy.（非 happy）→1F；难的是 maths problem 不是 poem→2F；Mike 说 May I use your pen?（不是 pencil）→3F；续说 draw a picture 懂了→4T；礼貌请求→5T。</w:t>
-      </w:r>
-    </w:p>
-    <w:p>
-      <w:pPr>
-        <w:spacing w:before="0" w:after="80" w:line="240" w:lineRule="auto"/>
-      </w:pPr>
-      <w:r>
-        <w:rPr>
-          <w:rFonts w:ascii="宋体" w:hAnsi="宋体" w:eastAsia="宋体"/>
-          <w:b w:val="0"/>
-          <w:sz w:val="22"/>
-        </w:rPr>
-        <w:t>五、听短文选择：1C  2B  3A  4A  5C</w:t>
+        <w:t>【Answers】1T  2F  3T  4F  5T  6F  7F  8T</w:t>
       </w:r>
     </w:p>
     <w:p>
@@ -183,7 +196,449 @@
           <w:b w:val="0"/>
           <w:sz w:val="18"/>
         </w:rPr>
-        <w:t>依据：back at school；very happy；Miss Green is their new English teacher；friends give her a gift；book is in Mike's schoolbag.</w:t>
+        <w:t>依据：1 兴奋跳跃相符；2 图为黑猫≠white；3 生病在床相符；4 地上玩耍≠read books；5 排队相符；6 图为汉堡薯条≠apple；7 尺子/本子≠eraser；8 睡觉休息相符。</w:t>
+      </w:r>
+    </w:p>
+    <w:p>
+      <w:pPr>
+        <w:spacing w:before="0" w:after="80" w:line="240" w:lineRule="auto"/>
+      </w:pPr>
+      <w:r>
+        <w:rPr>
+          <w:rFonts w:ascii="宋体" w:hAnsi="宋体" w:eastAsia="宋体"/>
+          <w:b/>
+          <w:sz w:val="24"/>
+        </w:rPr>
+        <w:t>二、听对话排序 A—E</w:t>
+      </w:r>
+    </w:p>
+    <w:p>
+      <w:pPr>
+        <w:spacing w:before="0" w:after="40" w:line="240" w:lineRule="auto"/>
+      </w:pPr>
+      <w:r>
+        <w:rPr>
+          <w:rFonts w:ascii="宋体" w:hAnsi="宋体" w:eastAsia="宋体"/>
+          <w:b/>
+          <w:sz w:val="20"/>
+        </w:rPr>
+        <w:t>【Listening script】（heard in this order = A → E）</w:t>
+      </w:r>
+    </w:p>
+    <w:p>
+      <w:pPr>
+        <w:spacing w:before="0" w:after="40" w:line="240" w:lineRule="auto"/>
+      </w:pPr>
+      <w:r>
+        <w:rPr>
+          <w:rFonts w:ascii="宋体" w:hAnsi="宋体" w:eastAsia="宋体"/>
+          <w:b w:val="0"/>
+          <w:sz w:val="18"/>
+        </w:rPr>
+        <w:t>A. What's the matter, Amy? — I can't find my English book. — Don't worry. Let me help you look for it.</w:t>
+      </w:r>
+    </w:p>
+    <w:p>
+      <w:pPr>
+        <w:spacing w:before="0" w:after="40" w:line="240" w:lineRule="auto"/>
+      </w:pPr>
+      <w:r>
+        <w:rPr>
+          <w:rFonts w:ascii="宋体" w:hAnsi="宋体" w:eastAsia="宋体"/>
+          <w:b w:val="0"/>
+          <w:sz w:val="18"/>
+        </w:rPr>
+        <w:t>B. What are you reading? — I'm reading a story.</w:t>
+      </w:r>
+    </w:p>
+    <w:p>
+      <w:pPr>
+        <w:spacing w:before="0" w:after="40" w:line="240" w:lineRule="auto"/>
+      </w:pPr>
+      <w:r>
+        <w:rPr>
+          <w:rFonts w:ascii="宋体" w:hAnsi="宋体" w:eastAsia="宋体"/>
+          <w:b w:val="0"/>
+          <w:sz w:val="18"/>
+        </w:rPr>
+        <w:t>C. I can't remember this. — You can read it aloud.</w:t>
+      </w:r>
+    </w:p>
+    <w:p>
+      <w:pPr>
+        <w:spacing w:before="0" w:after="40" w:line="240" w:lineRule="auto"/>
+      </w:pPr>
+      <w:r>
+        <w:rPr>
+          <w:rFonts w:ascii="宋体" w:hAnsi="宋体" w:eastAsia="宋体"/>
+          <w:b w:val="0"/>
+          <w:sz w:val="18"/>
+        </w:rPr>
+        <w:t>D. May I speak to Mike? — Sorry, Mike is sleeping. — May I call him later? — Of course.</w:t>
+      </w:r>
+    </w:p>
+    <w:p>
+      <w:pPr>
+        <w:spacing w:before="0" w:after="40" w:line="240" w:lineRule="auto"/>
+      </w:pPr>
+      <w:r>
+        <w:rPr>
+          <w:rFonts w:ascii="宋体" w:hAnsi="宋体" w:eastAsia="宋体"/>
+          <w:b w:val="0"/>
+          <w:sz w:val="18"/>
+        </w:rPr>
+        <w:t>E. Would you do me a favour? — What can I do for you? — Can I use your pencil? — Sure. Here you are.</w:t>
+      </w:r>
+    </w:p>
+    <w:p>
+      <w:pPr>
+        <w:spacing w:before="0" w:after="160" w:line="240" w:lineRule="auto"/>
+      </w:pPr>
+      <w:r>
+        <w:rPr>
+          <w:rFonts w:ascii="宋体" w:hAnsi="宋体" w:eastAsia="宋体"/>
+          <w:b w:val="0"/>
+          <w:sz w:val="20"/>
+        </w:rPr>
+        <w:t>【Answers】卷面图片左→右依次标：D  B  C  E  A（听音顺序为材料 A→E；图序对应：电话睡觉 / 读故事 / 大声读 / 借铅笔 / 找英语书）。</w:t>
+      </w:r>
+    </w:p>
+    <w:p>
+      <w:pPr>
+        <w:spacing w:before="0" w:after="80" w:line="240" w:lineRule="auto"/>
+      </w:pPr>
+      <w:r>
+        <w:rPr>
+          <w:rFonts w:ascii="宋体" w:hAnsi="宋体" w:eastAsia="宋体"/>
+          <w:b/>
+          <w:sz w:val="24"/>
+        </w:rPr>
+        <w:t>三、听选答语</w:t>
+      </w:r>
+    </w:p>
+    <w:p>
+      <w:pPr>
+        <w:spacing w:before="0" w:after="40" w:line="240" w:lineRule="auto"/>
+      </w:pPr>
+      <w:r>
+        <w:rPr>
+          <w:rFonts w:ascii="宋体" w:hAnsi="宋体" w:eastAsia="宋体"/>
+          <w:b/>
+          <w:sz w:val="20"/>
+        </w:rPr>
+        <w:t>【Listening script】</w:t>
+      </w:r>
+    </w:p>
+    <w:p>
+      <w:pPr>
+        <w:spacing w:before="0" w:after="40" w:line="240" w:lineRule="auto"/>
+      </w:pPr>
+      <w:r>
+        <w:rPr>
+          <w:rFonts w:ascii="宋体" w:hAnsi="宋体" w:eastAsia="宋体"/>
+          <w:b w:val="0"/>
+          <w:sz w:val="20"/>
+        </w:rPr>
+        <w:t>1. Excuse me, would you please open the window?</w:t>
+      </w:r>
+    </w:p>
+    <w:p>
+      <w:pPr>
+        <w:spacing w:before="0" w:after="40" w:line="240" w:lineRule="auto"/>
+      </w:pPr>
+      <w:r>
+        <w:rPr>
+          <w:rFonts w:ascii="宋体" w:hAnsi="宋体" w:eastAsia="宋体"/>
+          <w:b w:val="0"/>
+          <w:sz w:val="20"/>
+        </w:rPr>
+        <w:t>2. How do you feel today?</w:t>
+      </w:r>
+    </w:p>
+    <w:p>
+      <w:pPr>
+        <w:spacing w:before="0" w:after="40" w:line="240" w:lineRule="auto"/>
+      </w:pPr>
+      <w:r>
+        <w:rPr>
+          <w:rFonts w:ascii="宋体" w:hAnsi="宋体" w:eastAsia="宋体"/>
+          <w:b w:val="0"/>
+          <w:sz w:val="20"/>
+        </w:rPr>
+        <w:t>3. What's the matter? You look angry.</w:t>
+      </w:r>
+    </w:p>
+    <w:p>
+      <w:pPr>
+        <w:spacing w:before="0" w:after="40" w:line="240" w:lineRule="auto"/>
+      </w:pPr>
+      <w:r>
+        <w:rPr>
+          <w:rFonts w:ascii="宋体" w:hAnsi="宋体" w:eastAsia="宋体"/>
+          <w:b w:val="0"/>
+          <w:sz w:val="20"/>
+        </w:rPr>
+        <w:t>4. What does he look like?</w:t>
+      </w:r>
+    </w:p>
+    <w:p>
+      <w:pPr>
+        <w:spacing w:before="0" w:after="40" w:line="240" w:lineRule="auto"/>
+      </w:pPr>
+      <w:r>
+        <w:rPr>
+          <w:rFonts w:ascii="宋体" w:hAnsi="宋体" w:eastAsia="宋体"/>
+          <w:b w:val="0"/>
+          <w:sz w:val="20"/>
+        </w:rPr>
+        <w:t>5. Can I fly a kite with you?</w:t>
+      </w:r>
+    </w:p>
+    <w:p>
+      <w:pPr>
+        <w:spacing w:before="0" w:after="40" w:line="240" w:lineRule="auto"/>
+      </w:pPr>
+      <w:r>
+        <w:rPr>
+          <w:rFonts w:ascii="宋体" w:hAnsi="宋体" w:eastAsia="宋体"/>
+          <w:b/>
+          <w:sz w:val="22"/>
+        </w:rPr>
+        <w:t>【Answers】1A  2B  3B  4A  5A</w:t>
+      </w:r>
+    </w:p>
+    <w:p>
+      <w:pPr>
+        <w:spacing w:before="0" w:after="160" w:line="240" w:lineRule="auto"/>
+      </w:pPr>
+      <w:r>
+        <w:rPr>
+          <w:rFonts w:ascii="宋体" w:hAnsi="宋体" w:eastAsia="宋体"/>
+          <w:b w:val="0"/>
+          <w:sz w:val="18"/>
+        </w:rPr>
+        <w:t>1 open the window → Sure.  2 How do you feel → I am happy.  3 angry → My toy car is broken.  4 look like → tall with short hair.  5 fly a kite → Of course. Let's do it together.</w:t>
+      </w:r>
+    </w:p>
+    <w:p>
+      <w:pPr>
+        <w:spacing w:before="0" w:after="80" w:line="240" w:lineRule="auto"/>
+      </w:pPr>
+      <w:r>
+        <w:rPr>
+          <w:rFonts w:ascii="宋体" w:hAnsi="宋体" w:eastAsia="宋体"/>
+          <w:b/>
+          <w:sz w:val="24"/>
+        </w:rPr>
+        <w:t>四、听对话判断 T/F</w:t>
+      </w:r>
+    </w:p>
+    <w:p>
+      <w:pPr>
+        <w:spacing w:before="0" w:after="40" w:line="240" w:lineRule="auto"/>
+      </w:pPr>
+      <w:r>
+        <w:rPr>
+          <w:rFonts w:ascii="宋体" w:hAnsi="宋体" w:eastAsia="宋体"/>
+          <w:b/>
+          <w:sz w:val="20"/>
+        </w:rPr>
+        <w:t>【Listening script】</w:t>
+      </w:r>
+    </w:p>
+    <w:p>
+      <w:pPr>
+        <w:spacing w:before="0" w:after="20" w:line="240" w:lineRule="auto"/>
+      </w:pPr>
+      <w:r>
+        <w:rPr>
+          <w:rFonts w:ascii="宋体" w:hAnsi="宋体" w:eastAsia="宋体"/>
+          <w:b w:val="0"/>
+          <w:sz w:val="20"/>
+        </w:rPr>
+        <w:t>Mike: Hi! Linda. How do you feel now?</w:t>
+      </w:r>
+    </w:p>
+    <w:p>
+      <w:pPr>
+        <w:spacing w:before="0" w:after="20" w:line="240" w:lineRule="auto"/>
+      </w:pPr>
+      <w:r>
+        <w:rPr>
+          <w:rFonts w:ascii="宋体" w:hAnsi="宋体" w:eastAsia="宋体"/>
+          <w:b w:val="0"/>
+          <w:sz w:val="20"/>
+        </w:rPr>
+        <w:t>Linda: Not very happy.</w:t>
+      </w:r>
+    </w:p>
+    <w:p>
+      <w:pPr>
+        <w:spacing w:before="0" w:after="20" w:line="240" w:lineRule="auto"/>
+      </w:pPr>
+      <w:r>
+        <w:rPr>
+          <w:rFonts w:ascii="宋体" w:hAnsi="宋体" w:eastAsia="宋体"/>
+          <w:b w:val="0"/>
+          <w:sz w:val="20"/>
+        </w:rPr>
+        <w:t>Mike: What's the matter?</w:t>
+      </w:r>
+    </w:p>
+    <w:p>
+      <w:pPr>
+        <w:spacing w:before="0" w:after="20" w:line="240" w:lineRule="auto"/>
+      </w:pPr>
+      <w:r>
+        <w:rPr>
+          <w:rFonts w:ascii="宋体" w:hAnsi="宋体" w:eastAsia="宋体"/>
+          <w:b w:val="0"/>
+          <w:sz w:val="20"/>
+        </w:rPr>
+        <w:t>Linda: I don't understand this maths problem. It's so hard!</w:t>
+      </w:r>
+    </w:p>
+    <w:p>
+      <w:pPr>
+        <w:spacing w:before="0" w:after="20" w:line="240" w:lineRule="auto"/>
+      </w:pPr>
+      <w:r>
+        <w:rPr>
+          <w:rFonts w:ascii="宋体" w:hAnsi="宋体" w:eastAsia="宋体"/>
+          <w:b w:val="0"/>
+          <w:sz w:val="20"/>
+        </w:rPr>
+        <w:t>Mike: Let me help you. May I use your pen?</w:t>
+      </w:r>
+    </w:p>
+    <w:p>
+      <w:pPr>
+        <w:spacing w:before="0" w:after="20" w:line="240" w:lineRule="auto"/>
+      </w:pPr>
+      <w:r>
+        <w:rPr>
+          <w:rFonts w:ascii="宋体" w:hAnsi="宋体" w:eastAsia="宋体"/>
+          <w:b w:val="0"/>
+          <w:sz w:val="20"/>
+        </w:rPr>
+        <w:t>Linda: Sure. Here you are.</w:t>
+      </w:r>
+    </w:p>
+    <w:p>
+      <w:pPr>
+        <w:spacing w:before="0" w:after="20" w:line="240" w:lineRule="auto"/>
+      </w:pPr>
+      <w:r>
+        <w:rPr>
+          <w:rFonts w:ascii="宋体" w:hAnsi="宋体" w:eastAsia="宋体"/>
+          <w:b w:val="0"/>
+          <w:sz w:val="20"/>
+        </w:rPr>
+        <w:t>Mike: Look, you can draw a picture.</w:t>
+      </w:r>
+    </w:p>
+    <w:p>
+      <w:pPr>
+        <w:spacing w:before="0" w:after="20" w:line="240" w:lineRule="auto"/>
+      </w:pPr>
+      <w:r>
+        <w:rPr>
+          <w:rFonts w:ascii="宋体" w:hAnsi="宋体" w:eastAsia="宋体"/>
+          <w:b w:val="0"/>
+          <w:sz w:val="20"/>
+        </w:rPr>
+        <w:t>Linda: Oh! I see! Now I understand. Thank you, Mike.</w:t>
+      </w:r>
+    </w:p>
+    <w:p>
+      <w:pPr>
+        <w:spacing w:before="0" w:after="40" w:line="240" w:lineRule="auto"/>
+      </w:pPr>
+      <w:r>
+        <w:rPr>
+          <w:rFonts w:ascii="宋体" w:hAnsi="宋体" w:eastAsia="宋体"/>
+          <w:b/>
+          <w:sz w:val="22"/>
+        </w:rPr>
+        <w:t>【Answers】1F  2F  3F  4T  5T</w:t>
+      </w:r>
+    </w:p>
+    <w:p>
+      <w:pPr>
+        <w:spacing w:before="0" w:after="160" w:line="240" w:lineRule="auto"/>
+      </w:pPr>
+      <w:r>
+        <w:rPr>
+          <w:rFonts w:ascii="宋体" w:hAnsi="宋体" w:eastAsia="宋体"/>
+          <w:b w:val="0"/>
+          <w:sz w:val="18"/>
+        </w:rPr>
+        <w:t>1 Not very happy ≠ happy → F；2 maths problem ≠ poem → F；3 pen ≠ pencil → F；4 draw a picture to understand → T；5 polite request → T。</w:t>
+      </w:r>
+    </w:p>
+    <w:p>
+      <w:pPr>
+        <w:spacing w:before="0" w:after="80" w:line="240" w:lineRule="auto"/>
+      </w:pPr>
+      <w:r>
+        <w:rPr>
+          <w:rFonts w:ascii="宋体" w:hAnsi="宋体" w:eastAsia="宋体"/>
+          <w:b/>
+          <w:sz w:val="24"/>
+        </w:rPr>
+        <w:t>五、听短文选择</w:t>
+      </w:r>
+    </w:p>
+    <w:p>
+      <w:pPr>
+        <w:spacing w:before="0" w:after="40" w:line="240" w:lineRule="auto"/>
+      </w:pPr>
+      <w:r>
+        <w:rPr>
+          <w:rFonts w:ascii="宋体" w:hAnsi="宋体" w:eastAsia="宋体"/>
+          <w:b/>
+          <w:sz w:val="20"/>
+        </w:rPr>
+        <w:t>【Listening script】</w:t>
+      </w:r>
+    </w:p>
+    <w:p>
+      <w:pPr>
+        <w:spacing w:before="0" w:after="80" w:line="240" w:lineRule="auto"/>
+      </w:pPr>
+      <w:r>
+        <w:rPr>
+          <w:rFonts w:ascii="宋体" w:hAnsi="宋体" w:eastAsia="宋体"/>
+          <w:b w:val="0"/>
+          <w:sz w:val="20"/>
+        </w:rPr>
+        <w:t>It's September 1st. It's the first day of school. Children are back at school. They see many friends and teachers. They are very happy. Miss Green is their new English teacher. She is tall and beautiful. Today is Amy's birthday. She is so surprised. Her friends give her a gift. Mike is sad, because his new English book is missing. All the children look for it together. Oh, it's in Mike's schoolbag.</w:t>
+      </w:r>
+    </w:p>
+    <w:p>
+      <w:pPr>
+        <w:spacing w:before="0" w:after="40" w:line="240" w:lineRule="auto"/>
+      </w:pPr>
+      <w:r>
+        <w:rPr>
+          <w:rFonts w:ascii="宋体" w:hAnsi="宋体" w:eastAsia="宋体"/>
+          <w:b/>
+          <w:sz w:val="22"/>
+        </w:rPr>
+        <w:t>【Answers】1C  2B  3A  4A  5C</w:t>
+      </w:r>
+    </w:p>
+    <w:p>
+      <w:pPr>
+        <w:spacing w:before="0" w:after="200" w:line="240" w:lineRule="auto"/>
+      </w:pPr>
+      <w:r>
+        <w:rPr>
+          <w:rFonts w:ascii="宋体" w:hAnsi="宋体" w:eastAsia="宋体"/>
+          <w:b w:val="0"/>
+          <w:sz w:val="18"/>
+        </w:rPr>
+        <w:t>1 at school；2 happy；3 English teacher；4 gets a gift；5 in his schoolbag / bag。</w:t>
       </w:r>
     </w:p>
     <w:p>
@@ -196,12 +651,12 @@
           <w:b/>
           <w:sz w:val="24"/>
         </w:rPr>
-        <w:t>笔试部分</w:t>
+        <w:t>笔试部分 · 答案</w:t>
       </w:r>
     </w:p>
     <w:p>
       <w:pPr>
-        <w:spacing w:before="0" w:after="80" w:line="240" w:lineRule="auto"/>
+        <w:spacing w:before="0" w:after="40" w:line="240" w:lineRule="auto"/>
       </w:pPr>
       <w:r>
         <w:rPr>
@@ -235,7 +690,7 @@
           <w:b w:val="0"/>
           <w:sz w:val="22"/>
         </w:rPr>
-        <w:t>七、看图选短语：对照卷面附图勾选（选项 A–E）。</w:t>
+        <w:t>七、看图选短语：1D  2B  3A  4E  5C</w:t>
       </w:r>
     </w:p>
     <w:p>
@@ -248,7 +703,7 @@
           <w:b w:val="0"/>
           <w:sz w:val="18"/>
         </w:rPr>
-        <w:t>建议家长按图核对：对话/感冒/听音乐/整理桌子/开窗。</w:t>
+        <w:t>左→右：整理桌子 / 感冒 / 与朋友交谈 / 开窗 / 听音乐。</w:t>
       </w:r>
     </w:p>
     <w:p>
@@ -287,12 +742,12 @@
           <w:b w:val="0"/>
           <w:sz w:val="22"/>
         </w:rPr>
-        <w:t>十、故事排序：按短文情节 1→6（Wilma 第一 → Wilf&amp;Chip 第二 → Dad 第三 → Mum 最后 → 惊喜 → Mum 开心）。</w:t>
+        <w:t>十、故事排序：按短文情节标 1–6：Wilma 第一 → Wilf &amp; Chip 第二 → Dad 第三 → Mum 最后 → 惊喜 → Mum 开心。</w:t>
       </w:r>
     </w:p>
     <w:p>
       <w:pPr>
-        <w:spacing w:before="0" w:after="80" w:line="240" w:lineRule="auto"/>
+        <w:spacing w:before="0" w:after="40" w:line="240" w:lineRule="auto"/>
       </w:pPr>
       <w:r>
         <w:rPr>
@@ -305,7 +760,7 @@
     </w:p>
     <w:p>
       <w:pPr>
-        <w:spacing w:before="0" w:after="120" w:line="240" w:lineRule="auto"/>
+        <w:spacing w:before="0" w:after="80" w:line="240" w:lineRule="auto"/>
       </w:pPr>
       <w:r>
         <w:rPr>
@@ -326,7 +781,7 @@
           <w:b w:val="0"/>
           <w:sz w:val="20"/>
         </w:rPr>
-        <w:t>十一·任务二：开放作答。例：Don't climb the trees. / Please don't swim in the lake. / You can fly a kite here.</w:t>
+        <w:t>十一·任务二（参考）：Don't climb the trees. / Please don't swim in the lake. / You can fly a kite here.</w:t>
       </w:r>
     </w:p>
     <w:sectPr>

</xml_diff>